<commit_message>
Interfaz grafica, nucleo funcional escalable y validaciones
- nucleo.py: reglas puras; categorias, unidades, capacidad y politica del tope dentro del Estado
- interfaz_grafica.py: ventana tkinter con tema de sala de control
- consola.py: menu de texto como respaldo; central_emergencias.py es el lanzador
- Actualiza COMO_USARLO.md y la hoja de trabajo

Co-Authored-By: Claude Sonnet 5.5 <noreply@anthropic.com>
Claude-Session: https://claude.ai/code/session_019i8CCjNz5jMErJzfyRR73Y
</commit_message>
<xml_diff>
--- a/Hoja_de_trabajo_del_equipo.docx
+++ b/Hoja_de_trabajo_del_equipo.docx
@@ -242,7 +242,7 @@
               <w:rPr>
                 <w:rtl w:val="0"/>
               </w:rPr>
-              <w:t>Emergencia: tupla/dataclass inmutable (id, tipo, zona, gravedad, unidad). El id crece con la llegada y sirve para desempatar.</w:t>
+              <w:t>Emergencia: dataclass inmutable (id, tipo, zona, gravedad, unidad). El id crece con la llegada y sirve para desempatar.</w:t>
             </w:r>
           </w:p>
           <w:p>
@@ -254,7 +254,7 @@
           <w:p>
             <w:pPr/>
             <w:r>
-              <w:t>Estado: una tupla de emergencias + una tupla de unidades. Los datos iniciales (5 unidades, 6 zonas) están escritos en el código.</w:t>
+              <w:t>Estado: tuplas de emergencias y unidades, más las categorías (tipos, zonas, gravedades), la capacidad y la política del tope. Los datos iniciales (5 unidades, 6 zonas) están escritos en el código.</w:t>
             </w:r>
           </w:p>
           <w:p>
@@ -481,13 +481,13 @@
               <w:rPr>
                 <w:rtl w:val="0"/>
               </w:rPr>
-              <w:t>• Cada operación (registrar, asignar, cerrar) es una función pura: recibe el estado y devuelve (estado_nuevo, mensaje).</w:t>
+              <w:t>• Cada operación (registrar, asignar, cerrar, agregar unidad/tipo/zona) es una función pura en nucleo.py: recibe el estado y devuelve un Resultado con el estado nuevo y un mensaje.</w:t>
             </w:r>
           </w:p>
           <w:p>
             <w:pPr/>
             <w:r>
-              <w:t>• Se usan filter, map, sorted/min y reduce en vez de ciclos que cambian listas.</w:t>
+              <w:t>• Se usan comprensiones, sorted/min y Counter en vez de ciclos que cambian listas.</w:t>
             </w:r>
           </w:p>
           <w:p>
@@ -499,7 +499,7 @@
           <w:p>
             <w:pPr/>
             <w:r>
-              <w:t>• Solo main() lee y escribe en consola; el resto no tiene efectos secundarios.</w:t>
+              <w:t>• La ventana (interfaz_grafica.py) y la consola (consola.py) solo muestran el estado; ninguna tiene reglas.</w:t>
             </w:r>
           </w:p>
         </w:tc>

</xml_diff>